<commit_message>
Adopt ATS v3 condensed content as standard across all formats; fix all GitHub/LinkedIn links to correct URLs
Co-authored-by: Cursor <cursoragent@cursor.com>
</commit_message>
<xml_diff>
--- a/Sameer_Asif_Resume_ATS (1).docx
+++ b/Sameer_Asif_Resume_ATS (1).docx
@@ -86,7 +86,7 @@
         <w:pStyle w:val="FirstParagraph"/>
       </w:pPr>
       <w:r>
-        <w:t xml:space="preserve">AI/ML engineer and final-year BS Artificial Intelligence student at FAST-NUCES, currently building production machine-learning systems at Infigo Solutions. I work end-to-end across the ML lifecycle: data collection and pipelines, model architecture and training in PyTorch, and deployment behind FastAPI services and vector databases. My experience spans large language models and retrieval-augmented generation, computer vision, generative models such as GANs and U-Nets, and speech processing, with a track record of taking research ideas and prototypes through to deployed, real-time systems.</w:t>
+        <w:t xml:space="preserve">AI/ML Engineer and final-year BS Artificial Intelligence student at FAST-NUCES, building production ML systems at Infigo Solutions. Experienced across the full ML lifecycle: data pipelines, PyTorch model training, and deployment via FastAPI and vector databases. Expertise in LLMs, RAG, computer vision, generative models (GANs, U-Nets), and speech processing, with a track record of shipping research prototypes to real-time production systems.</w:t>
       </w:r>
     </w:p>
     <w:bookmarkEnd w:id="12"/>
@@ -134,13 +134,13 @@
           <w:b/>
           <w:bCs/>
         </w:rPr>
-        <w:t xml:space="preserve">Machine Learning:</w:t>
+        <w:t xml:space="preserve">ML Frameworks:</w:t>
       </w:r>
       <w:r>
         <w:t xml:space="preserve"> </w:t>
       </w:r>
       <w:r>
-        <w:t xml:space="preserve">PyTorch, Hugging Face Transformers, CNNs, GANs, U-Net, EfficientNet, multi-task learning, self-attention, ONNX</w:t>
+        <w:t xml:space="preserve">PyTorch, Hugging Face Transformers, CNNs, GANs, U-Net, EfficientNet, multi-task learning, ONNX</w:t>
       </w:r>
     </w:p>
     <w:p>
@@ -162,7 +162,7 @@
         <w:t xml:space="preserve"> </w:t>
       </w:r>
       <w:r>
-        <w:t xml:space="preserve">retrieval-augmented generation (RAG), pgvector, embeddings, semantic search, prompt engineering, LoRA/SFT, language modeling</w:t>
+        <w:t xml:space="preserve">RAG, pgvector, embeddings, semantic search, prompt engineering, LoRA/SFT, language modeling</w:t>
       </w:r>
     </w:p>
     <w:p>
@@ -178,13 +178,13 @@
           <w:b/>
           <w:bCs/>
         </w:rPr>
-        <w:t xml:space="preserve">Computer Vision &amp; Speech:</w:t>
+        <w:t xml:space="preserve">CV &amp; Speech:</w:t>
       </w:r>
       <w:r>
         <w:t xml:space="preserve"> </w:t>
       </w:r>
       <w:r>
-        <w:t xml:space="preserve">OpenCV, timm, object detection, facial-expression recognition, faster-whisper (STT), Spark-TTS, librosa</w:t>
+        <w:t xml:space="preserve">OpenCV, timm, object detection, facial expression recognition, faster-whisper, Spark-TTS, librosa</w:t>
       </w:r>
     </w:p>
     <w:p>
@@ -206,7 +206,7 @@
         <w:t xml:space="preserve"> </w:t>
       </w:r>
       <w:r>
-        <w:t xml:space="preserve">FastAPI, REST APIs, WebSockets, async Python, Playwright, SQL Server, PostgreSQL/pgvector, SQLAlchemy, pandas, NumPy</w:t>
+        <w:t xml:space="preserve">FastAPI, REST APIs, WebSockets, async Python, PostgreSQL/pgvector, SQL Server, SQLAlchemy, pandas, NumPy</w:t>
       </w:r>
     </w:p>
     <w:p>
@@ -267,7 +267,7 @@
         </w:numPr>
       </w:pPr>
       <w:r>
-        <w:t xml:space="preserve">Lead developer of the company’s AI customer-support assistant, a multi-channel application (website, WhatsApp, and Slack) built with FastAPI and PostgreSQL (pgvector) and deployed on Vercel, now running live on infigosolutions.com.</w:t>
+        <w:t xml:space="preserve">Lead developer of a multi-channel AI customer support assistant (website, WhatsApp, Slack) using FastAPI and PostgreSQL (pgvector), live at infigosolutions.com.</w:t>
       </w:r>
     </w:p>
     <w:p>
@@ -279,7 +279,7 @@
         </w:numPr>
       </w:pPr>
       <w:r>
-        <w:t xml:space="preserve">Designed and built a retrieval-augmented generation (RAG) pipeline: document chunking, embeddings stored in pgvector, cosine top-k search with a full-text-search fallback, and ERP context (customers, orders, invoices) injected into model prompts.</w:t>
+        <w:t xml:space="preserve">Designed a RAG pipeline: document chunking, pgvector embeddings, cosine top-k search with full-text fallback, and ERP context (customers, orders, invoices) injected into model prompts.</w:t>
       </w:r>
     </w:p>
     <w:p>
@@ -291,7 +291,7 @@
         </w:numPr>
       </w:pPr>
       <w:r>
-        <w:t xml:space="preserve">Added cost and safety controls around a Groq-hosted Llama 3.1 8B model, including answer caching, token-budget tracking, retrieval limits, and escalation rules, to keep responses accurate and within budget.</w:t>
+        <w:t xml:space="preserve">Added cost and safety controls around a Groq-hosted Llama 3.1 8B model: answer caching, token-budget tracking, retrieval limits, and escalation rules.</w:t>
       </w:r>
     </w:p>
     <w:p>
@@ -303,7 +303,7 @@
         </w:numPr>
       </w:pPr>
       <w:r>
-        <w:t xml:space="preserve">Built an embeddable React chat widget and a public chat API, and authored the database migrations, synthetic seed data, and smoke tests used across releases.</w:t>
+        <w:t xml:space="preserve">Built an embeddable React chat widget and public chat API; authored database migrations, seed data, and smoke tests.</w:t>
       </w:r>
     </w:p>
     <w:bookmarkEnd w:id="14"/>
@@ -333,7 +333,7 @@
         </w:numPr>
       </w:pPr>
       <w:r>
-        <w:t xml:space="preserve">Built an asynchronous web-scraping pipeline (Clutch, Wellfound) that collected company and contact data at scale and loaded it into a normalized SQL Server database used by the sales team for lead generation.</w:t>
+        <w:t xml:space="preserve">Built an async web-scraping pipeline (Clutch, Wellfound) loading company and contact data into SQL Server for sales lead generation; added anti-bot handling and resumable progress tracking.</w:t>
       </w:r>
     </w:p>
     <w:p>
@@ -345,19 +345,7 @@
         </w:numPr>
       </w:pPr>
       <w:r>
-        <w:t xml:space="preserve">Added anti-bot handling, resumable progress tracking, and regex-based extraction of emails, phone numbers, and LinkedIn profiles to keep long scraping runs reliable.</w:t>
-      </w:r>
-    </w:p>
-    <w:p>
-      <w:pPr>
-        <w:pStyle w:val="Compact"/>
-        <w:numPr>
-          <w:ilvl w:val="0"/>
-          <w:numId w:val="1003"/>
-        </w:numPr>
-      </w:pPr>
-      <w:r>
-        <w:t xml:space="preserve">Developed the first prototype of the support chatbot with its initial deployment and authentication flow, which led to a full-time offer.</w:t>
+        <w:t xml:space="preserve">Developed the initial support chatbot prototype with deployment and authentication flow, which led to a full-time offer.</w:t>
       </w:r>
     </w:p>
     <w:bookmarkEnd w:id="15"/>
@@ -384,6 +372,12 @@
       <w:pPr>
         <w:pStyle w:val="FirstParagraph"/>
       </w:pPr>
+      <w:r>
+        <w:t xml:space="preserve">PyTorch, ONNX, Hugging Face, Unity ·</w:t>
+      </w:r>
+      <w:r>
+        <w:t xml:space="preserve"> </w:t>
+      </w:r>
       <w:hyperlink r:id="rId17">
         <w:r>
           <w:rPr>
@@ -392,12 +386,6 @@
           <w:t xml:space="preserve">GitHub</w:t>
         </w:r>
       </w:hyperlink>
-      <w:r>
-        <w:t xml:space="preserve"> </w:t>
-      </w:r>
-      <w:r>
-        <w:t xml:space="preserve">· PyTorch, ONNX, Hugging Face, Unity</w:t>
-      </w:r>
     </w:p>
     <w:p>
       <w:pPr>
@@ -408,7 +396,7 @@
         </w:numPr>
       </w:pPr>
       <w:r>
-        <w:t xml:space="preserve">Trained facial-expression recognition models across seven public datasets (DFEW, FERV39k, FER2013, RAF-DB, CK+, Aff-Wild2, RAVDESS) and mapped them to a four-class stress schema, fusing video, audio, and heart-rate signals into a single real-time stress classifier consumed by a Unity game.</w:t>
+        <w:t xml:space="preserve">Trained facial expression recognition across 7 datasets (DFEW, FERV39k, FER2013, RAF-DB, CK+, Aff-Wild2, RAVDESS), fusing video, audio, and heart-rate signals into a real-time stress classifier.</w:t>
       </w:r>
     </w:p>
     <w:p>
@@ -420,19 +408,7 @@
         </w:numPr>
       </w:pPr>
       <w:r>
-        <w:t xml:space="preserve">Designed a stress-conditioned Fusion Generator (a ~500K-parameter MLP with sub-millisecond GPU inference) that outputs 30 parameters driving the game’s audio, DSP, lighting, camera, and entity behaviour.</w:t>
-      </w:r>
-    </w:p>
-    <w:p>
-      <w:pPr>
-        <w:pStyle w:val="Compact"/>
-        <w:numPr>
-          <w:ilvl w:val="0"/>
-          <w:numId w:val="1004"/>
-        </w:numPr>
-      </w:pPr>
-      <w:r>
-        <w:t xml:space="preserve">Trained a conditional WaveGAN (~2M parameters) for procedural horror audio and a conditional U-Net (~3M parameters, 256×256) for real-time PBR texture corruption, exporting every model to ONNX for Unity Barracuda/Sentis.</w:t>
+        <w:t xml:space="preserve">Built a stress-conditioned Fusion Generator (~500K params, sub-ms inference), WaveGAN (~2M params) for procedural audio, and a U-Net (~3M params, 256x256) for texture corruption; exported all to ONNX for Unity.</w:t>
       </w:r>
     </w:p>
     <w:bookmarkEnd w:id="18"/>
@@ -449,6 +425,12 @@
       <w:pPr>
         <w:pStyle w:val="FirstParagraph"/>
       </w:pPr>
+      <w:r>
+        <w:t xml:space="preserve">FastAPI, PyTorch, faster-whisper, Spark-TTS, React ·</w:t>
+      </w:r>
+      <w:r>
+        <w:t xml:space="preserve"> </w:t>
+      </w:r>
       <w:hyperlink r:id="rId19">
         <w:r>
           <w:rPr>
@@ -457,12 +439,6 @@
           <w:t xml:space="preserve">GitHub</w:t>
         </w:r>
       </w:hyperlink>
-      <w:r>
-        <w:t xml:space="preserve"> </w:t>
-      </w:r>
-      <w:r>
-        <w:t xml:space="preserve">· FastAPI, PyTorch, faster-whisper, Spark-TTS, React</w:t>
-      </w:r>
     </w:p>
     <w:p>
       <w:pPr>
@@ -473,19 +449,7 @@
         </w:numPr>
       </w:pPr>
       <w:r>
-        <w:t xml:space="preserve">Built an end-to-end real-time voice assistant: faster-whisper speech-to-text on CUDA, a Groq-hosted Llama 3.1 8B model for responses, and Spark-TTS cloned-voice synthesis, all fitting within 16 GB of VRAM through warmup and on-demand model unloading.</w:t>
-      </w:r>
-    </w:p>
-    <w:p>
-      <w:pPr>
-        <w:pStyle w:val="Compact"/>
-        <w:numPr>
-          <w:ilvl w:val="0"/>
-          <w:numId w:val="1005"/>
-        </w:numPr>
-      </w:pPr>
-      <w:r>
-        <w:t xml:space="preserve">Developed a FastAPI backend with WebSocket audio streaming and a voice-registry REST API, plus a React/Vite frontend with consent-gated voice upload, automatic transcription, and live playback.</w:t>
+        <w:t xml:space="preserve">Real-time voice assistant: faster-whisper STT on CUDA + Llama 3.1 8B (Groq) + Spark-TTS cloned-voice synthesis within 16 GB VRAM. WebSocket audio streaming backend and React/Vite frontend.</w:t>
       </w:r>
     </w:p>
     <w:bookmarkEnd w:id="20"/>
@@ -502,6 +466,12 @@
       <w:pPr>
         <w:pStyle w:val="FirstParagraph"/>
       </w:pPr>
+      <w:r>
+        <w:t xml:space="preserve">PyTorch, timm, albumentations, OpenCV ·</w:t>
+      </w:r>
+      <w:r>
+        <w:t xml:space="preserve"> </w:t>
+      </w:r>
       <w:hyperlink r:id="rId21">
         <w:r>
           <w:rPr>
@@ -510,12 +480,6 @@
           <w:t xml:space="preserve">GitHub</w:t>
         </w:r>
       </w:hyperlink>
-      <w:r>
-        <w:t xml:space="preserve"> </w:t>
-      </w:r>
-      <w:r>
-        <w:t xml:space="preserve">· PyTorch, timm, albumentations, OpenCV</w:t>
-      </w:r>
     </w:p>
     <w:p>
       <w:pPr>
@@ -526,35 +490,29 @@
         </w:numPr>
       </w:pPr>
       <w:r>
-        <w:t xml:space="preserve">Built a 4.5M-parameter detector combining techniques from three recent research papers: an EfficientNet-B0 backbone with multi-scale feature fusion, spatial-attention gating, and three task heads for 21-class classification, bounding-box regression, and objectness scoring.</w:t>
-      </w:r>
-    </w:p>
-    <w:p>
-      <w:pPr>
-        <w:pStyle w:val="Compact"/>
-        <w:numPr>
-          <w:ilvl w:val="0"/>
-          <w:numId w:val="1006"/>
-        </w:numPr>
-      </w:pPr>
-      <w:r>
-        <w:t xml:space="preserve">Trained on the Missouri Camera Traps dataset with a stratified 70/15/15 split, an albumentations augmentation pipeline, gradient accumulation, OneCycle scheduling, and early stopping, tuned to fit a 6 GB GPU.</w:t>
+        <w:t xml:space="preserve">4.5M-parameter detector with EfficientNet-B0 backbone, multi-scale feature fusion, spatial-attention gating, and three task heads (21-class, bbox regression, objectness). Trained on Missouri Camera Traps dataset.</w:t>
       </w:r>
     </w:p>
     <w:bookmarkEnd w:id="22"/>
-    <w:bookmarkStart w:id="24" w:name="transformer-and-rag-from-scratch"/>
+    <w:bookmarkStart w:id="24" w:name="transformer-rag-from-scratch"/>
     <w:p>
       <w:pPr>
         <w:pStyle w:val="Heading3"/>
       </w:pPr>
       <w:r>
-        <w:t xml:space="preserve">Transformer and RAG from Scratch</w:t>
+        <w:t xml:space="preserve">Transformer &amp; RAG from Scratch</w:t>
       </w:r>
     </w:p>
     <w:p>
       <w:pPr>
         <w:pStyle w:val="FirstParagraph"/>
       </w:pPr>
+      <w:r>
+        <w:t xml:space="preserve">PyTorch, NumPy ·</w:t>
+      </w:r>
+      <w:r>
+        <w:t xml:space="preserve"> </w:t>
+      </w:r>
       <w:hyperlink r:id="rId23">
         <w:r>
           <w:rPr>
@@ -563,12 +521,6 @@
           <w:t xml:space="preserve">GitHub</w:t>
         </w:r>
       </w:hyperlink>
-      <w:r>
-        <w:t xml:space="preserve"> </w:t>
-      </w:r>
-      <w:r>
-        <w:t xml:space="preserve">· PyTorch, NumPy</w:t>
-      </w:r>
     </w:p>
     <w:p>
       <w:pPr>
@@ -579,19 +531,7 @@
         </w:numPr>
       </w:pPr>
       <w:r>
-        <w:t xml:space="preserve">Implemented a multi-task Transformer encoder from scratch in PyTorch for Amazon review understanding, reaching 82% sentiment accuracy and 99.7% derived-feature accuracy on a 7,497-sample test set.</w:t>
-      </w:r>
-    </w:p>
-    <w:p>
-      <w:pPr>
-        <w:pStyle w:val="Compact"/>
-        <w:numPr>
-          <w:ilvl w:val="0"/>
-          <w:numId w:val="1007"/>
-        </w:numPr>
-      </w:pPr>
-      <w:r>
-        <w:t xml:space="preserve">Built a Transformer decoder from scratch for explanation generation with retrieval-augmented context (top-3 cosine nearest neighbours) and analysed the retrieval versus no-retrieval perplexity trade-off.</w:t>
+        <w:t xml:space="preserve">Multi-task Transformer encoder achieving 82% sentiment accuracy on Amazon reviews. Decoder with top-3 cosine RAG context; analyzed retrieval vs. no-retrieval perplexity trade-off.</w:t>
       </w:r>
     </w:p>
     <w:bookmarkEnd w:id="24"/>
@@ -619,7 +559,7 @@
             <w:b/>
             <w:bCs/>
           </w:rPr>
-          <w:t xml:space="preserve">SIP — Restaurant Ordering App</w:t>
+          <w:t xml:space="preserve">SIP Restaurant Ordering App</w:t>
         </w:r>
       </w:hyperlink>
       <w:r>
@@ -633,7 +573,7 @@
         <w:t xml:space="preserve"> </w:t>
       </w:r>
       <w:r>
-        <w:t xml:space="preserve">React/Vite web app for QR scan-to-order dining, with category-based menu browsing, cart, and a full checkout flow, deployed on Vercel.</w:t>
+        <w:t xml:space="preserve">React/Vite QR scan-to-order dining app with menu browsing, cart, and checkout, deployed on Vercel.</w:t>
       </w:r>
     </w:p>
     <w:p>
@@ -665,7 +605,7 @@
         <w:t xml:space="preserve"> </w:t>
       </w:r>
       <w:r>
-        <w:t xml:space="preserve">from-scratch n-gram language models with Laplace smoothing and a right-to-left Streamlit interface, evaluated with perplexity.</w:t>
+        <w:t xml:space="preserve">from-scratch n-gram language models with a right-to-left Streamlit interface.</w:t>
       </w:r>
     </w:p>
     <w:p>
@@ -683,7 +623,7 @@
             <w:b/>
             <w:bCs/>
           </w:rPr>
-          <w:t xml:space="preserve">Sentinel Trading Bot</w:t>
+          <w:t xml:space="preserve">Sentinel Binance Trading Bot</w:t>
         </w:r>
       </w:hyperlink>
       <w:r>
@@ -697,7 +637,7 @@
         <w:t xml:space="preserve"> </w:t>
       </w:r>
       <w:r>
-        <w:t xml:space="preserve">automated Binance trading bot with an adaptive strategy that learns from past trades and uses Fear &amp; Greed and Reddit sentiment signals.</w:t>
+        <w:t xml:space="preserve">sentiment-driven adaptive trading strategy that learns from past trades.</w:t>
       </w:r>
     </w:p>
     <w:bookmarkEnd w:id="28"/>
@@ -733,17 +673,17 @@
         <w:pStyle w:val="BodyText"/>
       </w:pPr>
       <w:r>
-        <w:t xml:space="preserve">Relevant coursework: Deep Learning, Natural Language Processing, Computer Vision, Generative AI, Databases, Software Engineering, Data Structures &amp; Algorithms, Probability &amp; Statistics.</w:t>
+        <w:t xml:space="preserve">Relevant coursework: Deep Learning, NLP, Computer Vision, Generative AI, Databases, Software Engineering, Data Structures &amp; Algorithms, Probability &amp; Statistics.</w:t>
       </w:r>
     </w:p>
     <w:bookmarkEnd w:id="30"/>
-    <w:bookmarkStart w:id="31" w:name="cambridge-a-levels-and-o-levels"/>
+    <w:bookmarkStart w:id="31" w:name="cambridge-a-levels-o-levels"/>
     <w:p>
       <w:pPr>
         <w:pStyle w:val="Heading3"/>
       </w:pPr>
       <w:r>
-        <w:t xml:space="preserve">Cambridge A Levels and O Levels</w:t>
+        <w:t xml:space="preserve">Cambridge A Levels &amp; O Levels</w:t>
       </w:r>
     </w:p>
     <w:p>

</xml_diff>